<commit_message>
Release v13 aligned InDesign courseware and labs
</commit_message>
<xml_diff>
--- a/courseware/LP-Creating Stunning Print and Digital Publications with InDesign.docx
+++ b/courseware/LP-Creating Stunning Print and Digital Publications with InDesign.docx
@@ -179,7 +179,7 @@
           <w:color w:val="1F6FEB"/>
           <w:sz w:val="24"/>
         </w:rPr>
-        <w:t>Version 12.0</w:t>
+        <w:t>Version 13.0</w:t>
       </w:r>
     </w:p>
     <w:p>
@@ -381,6 +381,64 @@
                 <w:sz w:val="19"/>
               </w:rPr>
               <w:t>Major revision. Rebuilt against the current InDesign release and the TSC RET-DNI-4004-1.1 ability and knowledge statements. Expanded from 14 to 20 case-study activities built on a single running client brief (Harmony Petals). Added establishing the drawing requirement, effective resolution, the Links panel, compound paths and Pathfinder, object styles, preflight, package and PDF/X export, and reflowable vs fixed-layout EPUB. Schedule re-timed to 9:30 am – 6:30 pm with a 1-hour lunch. Slide references updated to the v12.0 deck.</w:t>
+            </w:r>
+          </w:p>
+        </w:tc>
+        <w:tc>
+          <w:tcPr>
+            <w:tcW w:type="dxa" w:w="2448"/>
+          </w:tcPr>
+          <w:p>
+            <w:r/>
+            <w:r>
+              <w:rPr>
+                <w:sz w:val="19"/>
+              </w:rPr>
+              <w:t>Dr Alfred Ang</w:t>
+            </w:r>
+          </w:p>
+        </w:tc>
+      </w:tr>
+      <w:tr>
+        <w:tc>
+          <w:tcPr>
+            <w:tcW w:type="dxa" w:w="2448"/>
+          </w:tcPr>
+          <w:p>
+            <w:r/>
+            <w:r>
+              <w:rPr>
+                <w:sz w:val="19"/>
+              </w:rPr>
+              <w:t>13.0</w:t>
+            </w:r>
+          </w:p>
+        </w:tc>
+        <w:tc>
+          <w:tcPr>
+            <w:tcW w:type="dxa" w:w="2448"/>
+          </w:tcPr>
+          <w:p>
+            <w:r/>
+            <w:r>
+              <w:rPr>
+                <w:sz w:val="19"/>
+              </w:rPr>
+              <w:t>22 August 2026</w:t>
+            </w:r>
+          </w:p>
+        </w:tc>
+        <w:tc>
+          <w:tcPr>
+            <w:tcW w:type="dxa" w:w="2448"/>
+          </w:tcPr>
+          <w:p>
+            <w:r/>
+            <w:r>
+              <w:rPr>
+                <w:sz w:val="19"/>
+              </w:rPr>
+              <w:t>Aligned the schedule and learning-outcome map to the v13.0 deck and the canonical 20-lab package. Added the required per-lab InDesign starter, printable instructions, evidence checklist and supporting exercise assets to the training-resource specification.</w:t>
             </w:r>
           </w:p>
         </w:tc>
@@ -616,9 +674,9 @@
           <w:color w:val="333333"/>
           <w:sz w:val="22"/>
         </w:rPr>
-        <w:t>Activity Reference (aligned to the learning outcomes)</w:t>
+        <w:t>Lab Reference (aligned to the learning outcomes)</w:t>
         <w:tab/>
-        <w:t>7</w:t>
+        <w:t>6</w:t>
       </w:r>
     </w:p>
     <w:p>
@@ -1413,7 +1471,7 @@
                 <w:b w:val="0"/>
                 <w:sz w:val="19"/>
               </w:rPr>
-              <w:t>Topic 1 · Activities 1, 3; Topic 3 · Activity 19</w:t>
+              <w:t>Topic 1 · Labs 1, 3; Topic 3 · Lab 19</w:t>
             </w:r>
           </w:p>
         </w:tc>
@@ -1464,7 +1522,7 @@
                 <w:b w:val="0"/>
                 <w:sz w:val="19"/>
               </w:rPr>
-              <w:t>Topic 1 · Activities 1–4</w:t>
+              <w:t>Topic 1 · Labs 1–4</w:t>
             </w:r>
           </w:p>
         </w:tc>
@@ -1515,7 +1573,7 @@
                 <w:b w:val="0"/>
                 <w:sz w:val="19"/>
               </w:rPr>
-              <w:t>Topic 1 · Activity 2; Topic 2 · Activities 7, 10; Topic 3 · Activities 19, 20</w:t>
+              <w:t>Topic 1 · Lab 2; Topic 2 · Labs 7, 10; Topic 3 · Labs 19, 20</w:t>
             </w:r>
           </w:p>
         </w:tc>
@@ -1566,7 +1624,7 @@
                 <w:b w:val="0"/>
                 <w:sz w:val="19"/>
               </w:rPr>
-              <w:t>Topic 2 · Activities 8–12; Topic 3 · Activities 13–20</w:t>
+              <w:t>Topic 2 · Labs 8–12; Topic 3 · Labs 13–20</w:t>
             </w:r>
           </w:p>
         </w:tc>
@@ -1879,7 +1937,7 @@
                 <w:color w:val="FFFFFF"/>
                 <w:sz w:val="20"/>
               </w:rPr>
-              <w:t>Topic / Activity  [slide reference]</w:t>
+              <w:t>Topic / Lab  [slide reference]</w:t>
             </w:r>
           </w:p>
         </w:tc>
@@ -2247,7 +2305,7 @@
                 <w:b w:val="0"/>
                 <w:sz w:val="19"/>
               </w:rPr>
-              <w:t>Topic 1 hands-on — Activity 1 Establish the Layout Requirement from a Client Brief; Activity 2 Create the Document and Explore the InDesign Workspace; Activity 3 Build a Parent Page with Automatic Page Numbering; Activity 4 Set Up Grids, Guides and a Modular Column Structure  [Slides 41-57]</w:t>
+              <w:t>Topic 1 hands-on — Lab 1 Establish the Layout Requirement from a Client Brief; Lab 2 Create the Document and Explore the InDesign Workspace; Lab 3 Build a Parent Page with Automatic Page Numbering; Lab 4 Set Up Grids, Guides and a Modular Column Structure  [Slides 41-57]</w:t>
             </w:r>
           </w:p>
         </w:tc>
@@ -2456,7 +2514,7 @@
                 <w:b w:val="0"/>
                 <w:sz w:val="19"/>
               </w:rPr>
-              <w:t>Topic 2 hands-on part 1 — Activity 5 Create Text Frames and Import Client Copy from Word; Activity 6 Thread Text Across Frames and Resolve Overset Copy; Activity 7 Place Graphics, Manage Links and Control Effective Resolution; Activity 8 Draw Custom Paths with the Pen and Pencil Tools  [Slides 75-91]</w:t>
+              <w:t>Topic 2 hands-on part 1 — Lab 5 Create Text Frames and Import Client Copy from Word; Lab 6 Thread Text Across Frames and Resolve Overset Copy; Lab 7 Place Graphics, Manage Links and Control Effective Resolution; Lab 8 Draw Custom Paths with the Pen and Pencil Tools  [Slides 75-91]</w:t>
             </w:r>
           </w:p>
         </w:tc>
@@ -2612,7 +2670,7 @@
                 <w:b w:val="0"/>
                 <w:sz w:val="19"/>
               </w:rPr>
-              <w:t>Topic 2 hands-on part 2 — Activity 9 Combine Shapes with Pathfinder and Wrap Text Around a Clipping Path; Activity 10 Build a Colour System with Swatches, Spot Colours and Gradients; Activity 11 Apply Transparency, Blending Modes and Effects for Print; Activity 12 Transform, Align and Organise Objects with Layers  [Slides 92-107]</w:t>
+              <w:t>Topic 2 hands-on part 2 — Lab 9 Combine Shapes with Pathfinder and Wrap Text Around a Clipping Path; Lab 10 Build a Colour System with Swatches, Spot Colours and Gradients; Lab 11 Apply Transparency, Blending Modes and Effects for Print; Lab 12 Transform, Align and Organise Objects with Layers  [Slides 92-107]</w:t>
             </w:r>
           </w:p>
         </w:tc>
@@ -2715,7 +2773,7 @@
                 <w:b w:val="0"/>
                 <w:sz w:val="19"/>
               </w:rPr>
-              <w:t>Topic 3 hands-on — Activity 13 Set Type on a Path for a Curved Masthead; Activity 14 Refine Character and Paragraph Formatting for Readability; Activity 15 Build and Apply a House Style Set; Activity 16 Import Data and Build a Formatted Price Table; Activity 17 Add Hyperlinks, Buttons and QR Codes for an Interactive Document; Activity 18 Animate Objects with Motion Presets and Page Transitions; Activity 19 Preflight, Package and Export a Print-Ready PDF/X; Activity 20 Export for Digital Delivery — Interactive PDF, EPUB and Publish Online  [Slides 125-157]</w:t>
+              <w:t>Topic 3 hands-on — Lab 13 Set Type on a Path for a Curved Masthead; Lab 14 Refine Character and Paragraph Formatting for Readability; Lab 15 Build and Apply a House Style Set; Lab 16 Import Data and Build a Formatted Price Table; Lab 17 Add Hyperlinks, Buttons and QR Codes for an Interactive Document; Lab 18 Animate Objects with Motion Presets and Page Transitions; Lab 19 Preflight, Package and Export a Print-Ready PDF/X; Lab 20 Export for Digital Delivery — Interactive PDF, EPUB and Publish Online  [Slides 125-157]</w:t>
             </w:r>
           </w:p>
         </w:tc>
@@ -2834,7 +2892,7 @@
           <w:color w:val="555B66"/>
           <w:sz w:val="18"/>
         </w:rPr>
-        <w:t>Note: Topic 2's key concepts are taught in two blocks either side of the first practice session, so its slide references intentionally return to an earlier range after the 14:45 activities.</w:t>
+        <w:t>Note: Topic 2's key concepts are taught in two blocks either side of the first practice session, so its slide references intentionally return to an earlier range after the 14:45 labs.</w:t>
       </w:r>
     </w:p>
     <w:p>
@@ -3035,7 +3093,7 @@
         <w:pStyle w:val="Heading1"/>
       </w:pPr>
       <w:r>
-        <w:t>Activity Reference (aligned to the learning outcomes)</w:t>
+        <w:t>Lab Reference (aligned to the learning outcomes)</w:t>
       </w:r>
     </w:p>
     <w:tbl>
@@ -3119,7 +3177,7 @@
                 <w:color w:val="FFFFFF"/>
                 <w:sz w:val="20"/>
               </w:rPr>
-              <w:t>Activities</w:t>
+              <w:t>Labs</w:t>
             </w:r>
           </w:p>
         </w:tc>
@@ -3377,7 +3435,7 @@
                 <w:color w:val="FFFFFF"/>
                 <w:sz w:val="20"/>
               </w:rPr>
-              <w:t>Activity</w:t>
+              <w:t>Lab</w:t>
             </w:r>
           </w:p>
         </w:tc>
@@ -3395,7 +3453,7 @@
                 <w:color w:val="FFFFFF"/>
                 <w:sz w:val="20"/>
               </w:rPr>
-              <w:t>Learning outcome and TSC reference</w:t>
+              <w:t>Learning outcome, starter and TSC reference</w:t>
             </w:r>
           </w:p>
         </w:tc>
@@ -3446,7 +3504,7 @@
                 <w:b w:val="0"/>
                 <w:sz w:val="18"/>
               </w:rPr>
-              <w:t>LO1 — Establish drawing and layout requirements from a client brief and translate them into a written InDesign document specification (TSC A1, A2).</w:t>
+              <w:t>LO1 — starter: restaurant-menu.indd — Establish drawing and layout requirements from a client brief and translate them into a written InDesign document specification (TSC A1, A2).</w:t>
             </w:r>
           </w:p>
         </w:tc>
@@ -3497,7 +3555,7 @@
                 <w:b w:val="0"/>
                 <w:sz w:val="18"/>
               </w:rPr>
-              <w:t>LO1 — Create an InDesign document to a stated specification and navigate the workspace, panels and selection tools with confidence (TSC A2, A3).</w:t>
+              <w:t>LO1 — starter: parent-pages.indd — Create an InDesign document to a stated specification and navigate the workspace, panels and selection tools with confidence (TSC A2, A3).</w:t>
             </w:r>
           </w:p>
         </w:tc>
@@ -3548,7 +3606,7 @@
                 <w:b w:val="0"/>
                 <w:sz w:val="18"/>
               </w:rPr>
-              <w:t>LO1 — Manage pages using parent pages, automatic numbering markers and the Adjust Layout feature so a multi-page publication remains maintainable (TSC A2, A4).</w:t>
+              <w:t>LO1 — starter: HP_LongDoc.indd — Manage pages using parent pages, automatic numbering markers and the Adjust Layout feature so a multi-page publication remains maintainable (TSC A2, A4).</w:t>
             </w:r>
           </w:p>
         </w:tc>
@@ -3599,7 +3657,7 @@
                 <w:b w:val="0"/>
                 <w:sz w:val="18"/>
               </w:rPr>
-              <w:t>LO1 — Determine document dimensions and structure by building a baseline grid, a document grid and a modular guide system that aligns every element on the page (TSC A2, A4).</w:t>
+              <w:t>LO1 — starter: HP_Brochure_1.indd — Determine document dimensions and structure by building a baseline grid, a document grid and a modular guide system that aligns every element on the page (TSC A2, A4).</w:t>
             </w:r>
           </w:p>
         </w:tc>
@@ -3650,7 +3708,7 @@
                 <w:b w:val="0"/>
                 <w:sz w:val="18"/>
               </w:rPr>
-              <w:t>LO2 — Determine the text areas of a layout and select the appropriate import method to bring supplied client copy into InDesign without corrupting the document's typography (TSC A2, A3).</w:t>
+              <w:t>LO2 — starter: HP_Brochure_1.indd — Determine the text areas of a layout and select the appropriate import method to bring supplied client copy into InDesign without corrupting the document's typography (TSC A2, A3).</w:t>
             </w:r>
           </w:p>
         </w:tc>
@@ -3701,7 +3759,7 @@
                 <w:b w:val="0"/>
                 <w:sz w:val="18"/>
               </w:rPr>
-              <w:t>LO2 — Refine a text layout by threading a story across multiple frames and pages, and diagnose and resolve overset text so no client copy is lost at output (TSC A2, A4).</w:t>
+              <w:t>LO2 — starter: HP_Brochure_2.indd — Refine a text layout by threading a story across multiple frames and pages, and diagnose and resolve overset text so no client copy is lost at output (TSC A2, A4).</w:t>
             </w:r>
           </w:p>
         </w:tc>
@@ -3752,7 +3810,7 @@
                 <w:b w:val="0"/>
                 <w:sz w:val="18"/>
               </w:rPr>
-              <w:t>LO2 — Identify and select appropriate image mediums and formats for print, place them into frames with correct fitting, and verify effective PPI meets the printer's requirement (TSC A3, A4).</w:t>
+              <w:t>LO2 — starter: HP_Magazine_1.indd — Identify and select appropriate image mediums and formats for print, place them into frames with correct fitting, and verify effective PPI meets the printer's requirement (TSC A3, A4).</w:t>
             </w:r>
           </w:p>
         </w:tc>
@@ -3803,7 +3861,7 @@
                 <w:b w:val="0"/>
                 <w:sz w:val="18"/>
               </w:rPr>
-              <w:t>LO2 — Establish drawing requirements and construct precise vector paths using anchor points, straight segments and Bezier curves to produce artwork to specification (TSC A1, A4).</w:t>
+              <w:t>LO2 — starter: HP_Magazine_1.indd — Establish drawing requirements and construct precise vector paths using anchor points, straight segments and Bezier curves to produce artwork to specification (TSC A1, A4).</w:t>
             </w:r>
           </w:p>
         </w:tc>
@@ -3854,7 +3912,7 @@
                 <w:b w:val="0"/>
                 <w:sz w:val="18"/>
               </w:rPr>
-              <w:t>LO2 — Refine drawings to meet project requirements by combining shapes into compound paths, applying Pathfinder operations and wrapping body copy around an irregular image silhouette (TSC A2, A4).</w:t>
+              <w:t>LO2 — starter: HP_Magazine_2.indd — Refine drawings to meet project requirements by combining shapes into compound paths, applying Pathfinder operations and wrapping body copy around an irregular image silhouette (TSC A2, A4).</w:t>
             </w:r>
           </w:p>
         </w:tc>
@@ -3905,7 +3963,7 @@
                 <w:b w:val="0"/>
                 <w:sz w:val="18"/>
               </w:rPr>
-              <w:t>LO2 — Identify and select appropriate colour mediums for the print process, and build a reusable, correctly specified swatch system including spot and process colours and gradients (TSC A1, A3).</w:t>
+              <w:t>LO2 — starter: HP_Magazine_3.indd — Identify and select appropriate colour mediums for the print process, and build a reusable, correctly specified swatch system including spot and process colours and gradients (TSC A1, A3).</w:t>
             </w:r>
           </w:p>
         </w:tc>
@@ -3956,7 +4014,7 @@
                 <w:b w:val="0"/>
                 <w:sz w:val="18"/>
               </w:rPr>
-              <w:t>LO2 — Refine layout elements using transparency, blending modes and the Effects panel while selecting settings appropriate to the chosen print medium (TSC A3, A4).</w:t>
+              <w:t>LO2 — starter: HP_Magazine_3.indd — Refine layout elements using transparency, blending modes and the Effects panel while selecting settings appropriate to the chosen print medium (TSC A3, A4).</w:t>
             </w:r>
           </w:p>
         </w:tc>
@@ -4007,7 +4065,7 @@
                 <w:b w:val="0"/>
                 <w:sz w:val="18"/>
               </w:rPr>
-              <w:t>LO2 — Manage objects by transforming them precisely, aligning and distributing them to the document structure, and organising the file with layers so it can be handed over and maintained (TSC A2, A4).</w:t>
+              <w:t>LO2 — starter: HP_InteractiveDoc.indd — Manage objects by transforming them precisely, aligning and distributing them to the document structure, and organising the file with layers so it can be handed over and maintained (TSC A2, A4).</w:t>
             </w:r>
           </w:p>
         </w:tc>
@@ -4058,7 +4116,7 @@
                 <w:b w:val="0"/>
                 <w:sz w:val="18"/>
               </w:rPr>
-              <w:t>LO3 — Refine a layout by placing and controlling type on a path so display typography follows the artwork geometry accurately (TSC A4).</w:t>
+              <w:t>LO3 — starter: HP_Magazine_5.indd — Refine a layout by placing and controlling type on a path so display typography follows the artwork geometry accurately (TSC A4).</w:t>
             </w:r>
           </w:p>
         </w:tc>
@@ -4109,7 +4167,7 @@
                 <w:b w:val="0"/>
                 <w:sz w:val="18"/>
               </w:rPr>
-              <w:t>LO3 — Refine drawings to meet project requirements by applying professional character and paragraph typography — kerning, tracking, leading, drop caps and nested styles (TSC A3, A4).</w:t>
+              <w:t>LO3 — starter: HP_Magazine_6.indd — Refine drawings to meet project requirements by applying professional character and paragraph typography — kerning, tracking, leading, drop caps and nested styles (TSC A3, A4).</w:t>
             </w:r>
           </w:p>
         </w:tc>
@@ -4160,7 +4218,7 @@
                 <w:b w:val="0"/>
                 <w:sz w:val="18"/>
               </w:rPr>
-              <w:t>LO3 — Refine drawings to project requirements by constructing a reusable paragraph, character and object style set that enforces a consistent house look across a publication (TSC A1, A4).</w:t>
+              <w:t>LO3 — starter: HP_Brochure_7.indd — Refine drawings to project requirements by constructing a reusable paragraph, character and object style set that enforces a consistent house look across a publication (TSC A1, A4).</w:t>
             </w:r>
           </w:p>
         </w:tc>
@@ -4211,7 +4269,7 @@
                 <w:b w:val="0"/>
                 <w:sz w:val="18"/>
               </w:rPr>
-              <w:t>LO3 — Refine a publication by importing tabular data, converting it to an InDesign table and formatting it with table and cell styles for repeatable, accurate presentation (TSC A3, A4).</w:t>
+              <w:t>LO3 — starter: Tables_A.indd — Refine a publication by importing tabular data, converting it to an InDesign table and formatting it with table and cell styles for repeatable, accurate presentation (TSC A3, A4).</w:t>
             </w:r>
           </w:p>
         </w:tc>
@@ -4262,7 +4320,7 @@
                 <w:b w:val="0"/>
                 <w:sz w:val="18"/>
               </w:rPr>
-              <w:t>LO3 — Refine a publication for a digital medium by adding hyperlinks, interactive buttons and generated QR codes that function reliably in the exported file (TSC A3, A4).</w:t>
+              <w:t>LO3 — starter: HP_InteractiveDoc_A.indd — Refine a publication for a digital medium by adding hyperlinks, interactive buttons and generated QR codes that function reliably in the exported file (TSC A3, A4).</w:t>
             </w:r>
           </w:p>
         </w:tc>
@@ -4313,7 +4371,7 @@
                 <w:b w:val="0"/>
                 <w:sz w:val="18"/>
               </w:rPr>
-              <w:t>LO3 — Refine a digital publication by applying animation, motion paths, timing controls and page transitions appropriate to the delivery medium (TSC A3, A4).</w:t>
+              <w:t>LO3 — starter: HP_Magazine_7.indd — Refine a digital publication by applying animation, motion paths, timing controls and page transitions appropriate to the delivery medium (TSC A3, A4).</w:t>
             </w:r>
           </w:p>
         </w:tc>
@@ -4364,7 +4422,7 @@
                 <w:b w:val="0"/>
                 <w:sz w:val="18"/>
               </w:rPr>
-              <w:t>LO3 — Refine and validate a document against print production requirements, then package the job and export a press-ready PDF/X file with correct bleed and marks (TSC A1, A3, A4).</w:t>
+              <w:t>LO3 — starter: travel_magazine_tutorial.indd — Refine and validate a document against print production requirements, then package the job and export a press-ready PDF/X file with correct bleed and marks (TSC A1, A3, A4).</w:t>
             </w:r>
           </w:p>
         </w:tc>
@@ -4415,7 +4473,7 @@
                 <w:b w:val="0"/>
                 <w:sz w:val="18"/>
               </w:rPr>
-              <w:t>LO3 — Identify and select the appropriate digital medium for a publication and export to it correctly, choosing between interactive PDF, reflowable EPUB, fixed-layout EPUB and Publish Online (TSC A1, A3, A4).</w:t>
+              <w:t>LO3 — starter: Little_Red_Hen-anim-after.indd — Identify and select the appropriate digital medium for a publication and export to it correctly, choosing between interactive PDF, reflowable EPUB, fixed-layout EPUB and Publish Online (TSC A1, A3, A4).</w:t>
             </w:r>
           </w:p>
         </w:tc>
@@ -4437,7 +4495,7 @@
         <w:rPr>
           <w:sz w:val="21"/>
         </w:rPr>
-        <w:t>Trainer slide deck (PPTX and PDF) — 167 slides, version v12.0</w:t>
+        <w:t>Trainer slide deck (PPTX and PDF) — 167 slides, version v13.0</w:t>
       </w:r>
     </w:p>
     <w:p>
@@ -4448,7 +4506,7 @@
         <w:rPr>
           <w:sz w:val="21"/>
         </w:rPr>
-        <w:t>Learner Guide (DOCX and PDF) — full step-by-step procedures for all 20 activities</w:t>
+        <w:t>Learner Guide (DOCX and PDF) — full step-by-step procedures for all 20 labs</w:t>
       </w:r>
     </w:p>
     <w:p>
@@ -4460,6 +4518,17 @@
           <w:sz w:val="21"/>
         </w:rPr>
         <w:t>This Lesson Plan (DOCX and PDF)</w:t>
+      </w:r>
+    </w:p>
+    <w:p>
+      <w:pPr>
+        <w:pStyle w:val="ListBullet"/>
+      </w:pPr>
+      <w:r>
+        <w:rPr>
+          <w:sz w:val="21"/>
+        </w:rPr>
+        <w:t>Twenty self-contained lab folders — each with an INDD starter, README, printable instructions, evidence checklist and supporting assets</w:t>
       </w:r>
     </w:p>
     <w:p>

</xml_diff>